<commit_message>
Report v2: restructure §2.7 into 5 subsections on OCR working principles
2.7.1 detect/recognize, 2.7.2 engine choice, 2.7.3 transfer learning +
synthetic data, 2.7.4 field extraction + entity resolution, 2.7.5 async
architecture. Formal academic prose, Heading 3 styled for TOC.

Co-Authored-By: Claude Opus 4.8 <noreply@anthropic.com>
</commit_message>
<xml_diff>
--- a/BaoCao_DATN_TownHub_v2.docx
+++ b/BaoCao_DATN_TownHub_v2.docx
@@ -9639,17 +9639,7 @@
         <w:jc w:val="left"/>
       </w:pPr>
       <w:r>
-        <w:rPr>
-          <w:rFonts w:ascii="Times New Roman" w:cs="Times New Roman" w:eastAsia="Times New Roman" w:hAnsi="Times New Roman"/>
-          <w:b/>
-          <w:bCs/>
-          <w:i w:val="false"/>
-          <w:iCs w:val="false"/>
-          <w:caps w:val="false"/>
-          <w:sz w:val="26"/>
-          <w:szCs w:val="26"/>
-        </w:rPr>
-        <w:t xml:space="preserve">2.7. Công nghệ AI/OCR (VietOCR) và xử lý nền</w:t>
+        <w:t xml:space="preserve">2.7. Công nghệ AI/OCR và xử lý nền</w:t>
       </w:r>
     </w:p>
     <w:p>
@@ -9659,7 +9649,17 @@
         <w:jc w:val="both"/>
       </w:pPr>
       <w:r>
-        <w:t xml:space="preserve">Để tự động hóa việc nhập liệu hóa đơn, hệ thống tích hợp mô-đun OCR (nhận dạng ký tự quang học) hỗ trợ ba lựa chọn engine nhằm so sánh và sử dụng linh hoạt: (1) Gemini Vision API — mô hình đa phương thức của Google, không cần huấn luyện; (2) VietOCR và (3) PaddleOCR — hai engine mã nguồn mở được fine-tune cho hóa đơn tiếng Việt. Mỗi hóa đơn trải qua hai bước: phát hiện vùng chữ (text detection) và nhận dạng ký tự (text recognition); trong đó PaddleOCR được fine-tune cả hai bước, còn VietOCR fine-tune bước nhận dạng.</w:t>
+        <w:t xml:space="preserve">Mô-đun OCR số hóa hóa đơn giấy hoặc ảnh chụp thành dữ liệu có cấu trúc nhằm giảm nhập liệu thủ công và sai sót. Mục này trình bày nguyên lý hoạt động của mô-đun theo năm khía cạnh: cơ chế nhận dạng, lựa chọn engine, phương pháp huấn luyện, trích xuất – đối chiếu dữ liệu và kiến trúc xử lý.</w:t>
+      </w:r>
+    </w:p>
+    <w:p>
+      <w:pPr>
+        <w:pStyle w:val="Heading3"/>
+        <w:spacing w:after="80" w:before="140" w:line="312"/>
+        <w:jc w:val="left"/>
+      </w:pPr>
+      <w:r>
+        <w:t xml:space="preserve">2.7.1. Nguyên lý nhận dạng: phát hiện và nhận dạng ký tự</w:t>
       </w:r>
     </w:p>
     <w:p>
@@ -9669,7 +9669,17 @@
         <w:jc w:val="both"/>
       </w:pPr>
       <w:r>
-        <w:t xml:space="preserve">Do hóa đơn giá trị gia tăng là dữ liệu tài chính nhạy cảm (mã số thuế, tên doanh nghiệp, số tiền), việc thu thập số lượng lớn hóa đơn thật để huấn luyện gặp rào cản về bảo mật, chi phí và tính đại diện. Vì vậy, hai engine mã nguồn mở được huấn luyện trên dữ liệu tổng hợp (synthetic data): bộ sinh mô phỏng đúng cấu trúc hóa đơn GTGT theo Nghị định 123/2020/NĐ-CP (ký hiệu, số hóa đơn, đơn vị bán hàng, mã số thuế, bảng hàng hóa, cộng tiền hàng, thuế suất, tổng thanh toán) cùng các điều kiện ảnh thực tế (nghiêng, nhiễu, dấu mộc, chữ ký, ánh sáng không đều). Cách tiếp cận này cho phép kiểm soát độ đa dạng và cân bằng nhãn, đồng thời tự động sinh nhãn cho cả hai bước phát hiện và nhận dạng — điều mà gán nhãn thủ công không khả thi ở quy mô hàng vạn mẫu. Chất lượng được đánh giá trên tập kiểm thử hóa đơn thực tế để phản ánh hiệu năng ngoài đời.</w:t>
+        <w:t xml:space="preserve">Quá trình nhận dạng được chia thành hai bước nối tiếp. Bước phát hiện (text detection) phân loại từng điểm ảnh thuộc vùng chữ hay nền rồi gom thành các hộp bao dòng văn bản (thuật toán Differentiable Binarization của PaddleOCR, CRAFT của EasyOCR). Bước nhận dạng (text recognition) chuyển ảnh trong mỗi hộp thành chuỗi ký tự: ảnh được trích đặc trưng bằng mạng tích chập (CNN), sau đó một mô hình chuỗi giải mã thành văn bản — VietOCR dùng bộ giải mã Transformer, PaddleOCR dùng cơ chế CTC. Do bước nhận dạng chỉ đọc chữ trong từng hộp nên nó không phụ thuộc vào bố cục tổng thể của hóa đơn.</w:t>
+      </w:r>
+    </w:p>
+    <w:p>
+      <w:pPr>
+        <w:pStyle w:val="Heading3"/>
+        <w:spacing w:after="80" w:before="140" w:line="312"/>
+        <w:jc w:val="left"/>
+      </w:pPr>
+      <w:r>
+        <w:t xml:space="preserve">2.7.2. Lựa chọn engine nhận dạng</w:t>
       </w:r>
     </w:p>
     <w:p>
@@ -9679,7 +9689,87 @@
         <w:jc w:val="both"/>
       </w:pPr>
       <w:r>
-        <w:t xml:space="preserve">Do xử lý ảnh tốn thời gian, chức năng OCR được thiết kế bất đồng bộ theo mô hình hàng đợi – tiến trình nền: yêu cầu được đẩy vào OcrJobQueue, tiến trình nền OcrProcessingWorker lấy ra và gọi IInvoiceOcrEngine (bản cài đặt VietOcrEngine gọi dịch vụ OCR, kèm MockOcrEngine phục vụ kiểm thử) với engine do người dùng chọn để trích xuất dữ liệu. Cách làm này giúp giao diện không bị chặn và dễ mở rộng khối lượng xử lý.</w:t>
+        <w:t xml:space="preserve">Hệ thống hỗ trợ ba engine dùng chung một giao diện, cho phép hoán đổi mà không ảnh hưởng các thành phần khác. Gemini Vision là mô hình thị giác – ngôn ngữ (VLM) hiểu trực tiếp toàn bộ ảnh và trả về dữ liệu có cấu trúc, không cần huấn luyện và bền với bố cục lạ, nhưng phụ thuộc dịch vụ đám mây và đưa dữ liệu ra ngoài hệ thống. VietOCR và PaddleOCR là mô hình mã nguồn mở, chạy ngoại tuyến, chi phí thấp và có thể tinh chỉnh (fine-tune) cho miền dữ liệu hóa đơn Việt Nam. Việc duy trì đồng thời ba engine phục vụ hai mục đích: so sánh hiệu năng một cách khách quan và dự phòng lẫn nhau khi gặp chứng từ khó.</w:t>
+      </w:r>
+    </w:p>
+    <w:p>
+      <w:pPr>
+        <w:pStyle w:val="Heading3"/>
+        <w:spacing w:after="80" w:before="140" w:line="312"/>
+        <w:jc w:val="left"/>
+      </w:pPr>
+      <w:r>
+        <w:t xml:space="preserve">2.7.3. Học chuyển giao và dữ liệu huấn luyện tổng hợp</w:t>
+      </w:r>
+    </w:p>
+    <w:p>
+      <w:pPr>
+        <w:spacing w:after="120" w:line="312"/>
+        <w:ind w:firstLine="567"/>
+        <w:jc w:val="both"/>
+      </w:pPr>
+      <w:r>
+        <w:t xml:space="preserve">Hai engine mã nguồn mở được tinh chỉnh theo nguyên lý học chuyển giao (transfer learning): thay vì huấn luyện từ đầu, hệ thống kế thừa bộ trọng số đã học đặc trưng chữ tổng quát rồi huấn luyện tiếp trên dữ liệu hóa đơn, nhờ đó hội tụ nhanh và cần ít dữ liệu hơn.</w:t>
+      </w:r>
+    </w:p>
+    <w:p>
+      <w:pPr>
+        <w:spacing w:after="120" w:line="312"/>
+        <w:ind w:firstLine="567"/>
+        <w:jc w:val="both"/>
+      </w:pPr>
+      <w:r>
+        <w:t xml:space="preserve">Do hóa đơn thật là dữ liệu tài chính nhạy cảm và khó thu thập ở số lượng lớn, dữ liệu huấn luyện được sinh tổng hợp (synthetic data): chương trình tự tạo hóa đơn mô phỏng đúng cấu trúc quy định tại Nghị định 123/2020/NĐ-CP, đồng thời tự sinh nhãn cho cả hai bước phát hiện và nhận dạng — điều mà gán nhãn thủ công ở quy mô hàng vạn mẫu là bất khả thi. Để mô hình bền với ảnh chụp/scan thực tế, dữ liệu được tăng cường (augmentation) theo nguyên lý ngẫu nhiên hóa miền (domain randomization): thêm nghiêng, méo phối cảnh, nhiễu, dấu mộc, chữ ký và nền chụp. Các phép biến hình hình học được áp đồng thời cho ảnh và cho toạ độ hộp bằng cùng một ma trận đồng dạng (homography) nên nhãn luôn khớp sau biến đổi. Ngoài ra, dữ liệu được sinh với nhiều biến thể bố cục để mô hình tổng quát hóa cho hóa đơn của nhiều nhà cung cấp khác nhau.</w:t>
+      </w:r>
+    </w:p>
+    <w:p>
+      <w:pPr>
+        <w:pStyle w:val="Heading3"/>
+        <w:spacing w:after="80" w:before="140" w:line="312"/>
+        <w:jc w:val="left"/>
+      </w:pPr>
+      <w:r>
+        <w:t xml:space="preserve">2.7.4. Trích xuất trường và đối chiếu thực thể</w:t>
+      </w:r>
+    </w:p>
+    <w:p>
+      <w:pPr>
+        <w:spacing w:after="120" w:line="312"/>
+        <w:ind w:firstLine="567"/>
+        <w:jc w:val="both"/>
+      </w:pPr>
+      <w:r>
+        <w:t xml:space="preserve">Kết quả nhận dạng là văn bản kèm toạ độ. Việc xác định ý nghĩa từng trường dựa trên nguyên tắc bám từ khóa nhãn thay vì vị trí cố định: vì hóa đơn GTGT được chuẩn hóa theo luật nên các nhãn bắt buộc (đơn vị bán hàng, mã số thuế, cộng tiền hàng, tiền thuế GTGT, tổng cộng tiền thanh toán) xuất hiện thống nhất giữa mọi nhà cung cấp; hệ thống tìm nhãn rồi lấy giá trị nằm cùng dòng hoặc dòng kế. Cơ chế này kèm tập từ đồng nghĩa và chuẩn hóa chuỗi (bỏ dấu tiếng Việt) nên bền với các cách ghi khác nhau.</w:t>
+      </w:r>
+    </w:p>
+    <w:p>
+      <w:pPr>
+        <w:spacing w:after="120" w:line="312"/>
+        <w:ind w:firstLine="567"/>
+        <w:jc w:val="both"/>
+      </w:pPr>
+      <w:r>
+        <w:t xml:space="preserve">Do cơ sở dữ liệu lưu theo khóa định danh trong khi OCR trả về văn bản, hệ thống thực hiện bước đối chiếu thực thể (entity resolution): mã số thuế được đối chiếu với nhà cung cấp (mã định danh duy nhất theo luật), tên hàng hóa được đối chiếu tương đồng với danh mục vật tư. Kết quả được đề xuất để người dùng xác nhận hoặc chỉnh sửa (mô hình human-in-the-loop) trước khi ghi vào hóa đơn, bảo đảm dữ liệu tự động vẫn chính xác và có kiểm soát.</w:t>
+      </w:r>
+    </w:p>
+    <w:p>
+      <w:pPr>
+        <w:pStyle w:val="Heading3"/>
+        <w:spacing w:after="80" w:before="140" w:line="312"/>
+        <w:jc w:val="left"/>
+      </w:pPr>
+      <w:r>
+        <w:t xml:space="preserve">2.7.5. Kiến trúc xử lý bất đồng bộ</w:t>
+      </w:r>
+    </w:p>
+    <w:p>
+      <w:pPr>
+        <w:spacing w:after="120" w:line="312"/>
+        <w:ind w:firstLine="567"/>
+        <w:jc w:val="both"/>
+      </w:pPr>
+      <w:r>
+        <w:t xml:space="preserve">Vì nhận dạng ảnh tốn thời gian, mô-đun áp dụng mô hình sản xuất – tiêu thụ (producer–consumer): yêu cầu OCR được đẩy vào hàng đợi và trả về ngay; một tiến trình nền lần lượt lấy công việc ra xử lý và cập nhật trạng thái (chờ → đang xử lý → hoàn tất), giao diện chỉ hỏi trạng thái theo chu kỳ. Nhờ đó giao diện không bị chặn và hệ thống mở rộng được khối lượng xử lý.</w:t>
       </w:r>
     </w:p>
     <w:p>

</xml_diff>

<commit_message>
Report v2: add §2.7.6 comparing EasyOCR+VietOCR vs PaddleOCR pipelines
Explains VietOCR is recognition-only (paired with EasyOCR/CRAFT for detection),
why only recognition is fine-tuned on the VietOCR branch, PaddleOCR's all-in-one
advantage (fine-tune both det+rec, layout-adaptive detection, lighter deploy),
and a direct comparison of the two pipeline combinations.

Co-Authored-By: Claude Opus 4.8 <noreply@anthropic.com>
</commit_message>
<xml_diff>
--- a/BaoCao_DATN_TownHub_v2.docx
+++ b/BaoCao_DATN_TownHub_v2.docx
@@ -9770,6 +9770,56 @@
       </w:pPr>
       <w:r>
         <w:t xml:space="preserve">Vì nhận dạng ảnh tốn thời gian, mô-đun áp dụng mô hình sản xuất – tiêu thụ (producer–consumer): yêu cầu OCR được đẩy vào hàng đợi và trả về ngay; một tiến trình nền lần lượt lấy công việc ra xử lý và cập nhật trạng thái (chờ → đang xử lý → hoàn tất), giao diện chỉ hỏi trạng thái theo chu kỳ. Nhờ đó giao diện không bị chặn và hệ thống mở rộng được khối lượng xử lý.</w:t>
+      </w:r>
+    </w:p>
+    <w:p>
+      <w:pPr>
+        <w:pStyle w:val="Heading3"/>
+        <w:spacing w:after="80" w:before="140" w:line="312"/>
+        <w:jc w:val="left"/>
+      </w:pPr>
+      <w:r>
+        <w:t xml:space="preserve">2.7.6. So sánh hai pipeline nhận dạng: EasyOCR + VietOCR và PaddleOCR</w:t>
+      </w:r>
+    </w:p>
+    <w:p>
+      <w:pPr>
+        <w:spacing w:after="120" w:line="312"/>
+        <w:ind w:firstLine="567"/>
+        <w:jc w:val="both"/>
+      </w:pPr>
+      <w:r>
+        <w:t xml:space="preserve">VietOCR chỉ cung cấp mô-đun nhận dạng ký tự (recognition), không kèm mô-đun phát hiện vùng chữ (detection). Do đó nhánh VietOCR phải ghép với một bộ phát hiện bên ngoài — cụ thể là EasyOCR (thuật toán CRAFT) — tạo thành quy trình hai bước tách rời: EasyOCR dò và cắt từng dòng chữ, sau đó VietOCR đọc nội dung từng dòng. Ngược lại, PaddleOCR là bộ công cụ trọn gói, tích hợp sẵn cả phát hiện (Differentiable Binarization) lẫn nhận dạng (SVTR_LCNet) trong cùng một khung huấn luyện.</w:t>
+      </w:r>
+    </w:p>
+    <w:p>
+      <w:pPr>
+        <w:spacing w:after="120" w:line="312"/>
+        <w:ind w:firstLine="567"/>
+        <w:jc w:val="both"/>
+      </w:pPr>
+      <w:r>
+        <w:t xml:space="preserve">Với nhánh VietOCR, đề tài chỉ fine-tune bước nhận dạng vì hai lý do. Thứ nhất, VietOCR chỉ mở phần recognition cho việc tinh chỉnh, còn bộ phát hiện của EasyOCR là mô hình đóng gói, khó huấn luyện lại trong cùng quy trình. Thứ hai, bước phát hiện ít phụ thuộc ngôn ngữ (dò vùng chữ về cơ bản giống nhau giữa các ngôn ngữ) nên lợi ích của fine-tune thấp; trong khi bước nhận dạng phụ thuộc mạnh vào đặc thù tiếng Việt (bộ dấu, kiểu chữ, định dạng số tiền và ngày tháng) — đây mới là nơi fine-tune mang lại cải thiện lớn nhất. Do vậy nguồn lực được tập trung vào recognition.</w:t>
+      </w:r>
+    </w:p>
+    <w:p>
+      <w:pPr>
+        <w:spacing w:after="120" w:line="312"/>
+        <w:ind w:firstLine="567"/>
+        <w:jc w:val="both"/>
+      </w:pPr>
+      <w:r>
+        <w:t xml:space="preserve">PaddleOCR có ưu thế ở tính trọn gói. Vì quản lý cả hai bước trong một khung, nó cho phép fine-tune đồng thời cả phát hiện lẫn nhận dạng cho miền hóa đơn tiếng Việt — điều nhánh VietOCR không làm được (bộ phát hiện EasyOCR buộc phải giữ nguyên). Nhờ đó bộ phát hiện của PaddleOCR có thể học đặc thù bố cục hóa đơn (mật độ dòng, bảng biểu, đường kẻ), trong khi EasyOCR/CRAFT là cố định. Ngoài ra, kiến trúc xương sống nhẹ (PP-LCNet) cùng công cụ export mô hình suy luận giúp PaddleOCR tối ưu tốc độ và thuận tiện triển khai.</w:t>
+      </w:r>
+    </w:p>
+    <w:p>
+      <w:pPr>
+        <w:spacing w:after="120" w:line="312"/>
+        <w:ind w:firstLine="567"/>
+        <w:jc w:val="both"/>
+      </w:pPr>
+      <w:r>
+        <w:t xml:space="preserve">So sánh trực tiếp hai tổ hợp: EasyOCR + VietOCR mạnh về nhận dạng tiếng Việt (VietOCR chuyên tiếng Việt với bộ giải mã Transformer) nhưng phần phát hiện cố định không tinh chỉnh được, lại phải phối hợp hai thư viện độc lập nên quy trình phức tạp và dễ phát sinh sai lệch khi cắt vùng chữ. Tổ hợp DB + SVTR_LCNet của PaddleOCR đồng bộ, fine-tune được cả hai bước và triển khai gọn trong một thư viện duy nhất. Vì vậy hệ thống duy trì cả hai engine để so sánh: VietOCR khai thác thế mạnh nhận dạng tiếng Việt, còn PaddleOCR khai thác ưu thế của một pipeline trọn gói tinh chỉnh được toàn trình.</w:t>
       </w:r>
     </w:p>
     <w:p>

</xml_diff>

<commit_message>
Report v2: input routing note (§2.7) + handwriting limitation & HTR future work
§2.7 intro now states PDF e-invoices are read via text extraction while only
images/scanned PDFs use OCR. Added handwriting recognition as the main OCR
limitation (routed to Gemini/manual) and Vietnamese HTR + XML e-invoice parsing
as future work.

Co-Authored-By: Claude Opus 4.8 <noreply@anthropic.com>
</commit_message>
<xml_diff>
--- a/BaoCao_DATN_TownHub_v2.docx
+++ b/BaoCao_DATN_TownHub_v2.docx
@@ -9649,7 +9649,7 @@
         <w:jc w:val="both"/>
       </w:pPr>
       <w:r>
-        <w:t xml:space="preserve">Mô-đun OCR số hóa hóa đơn giấy hoặc ảnh chụp thành dữ liệu có cấu trúc nhằm giảm nhập liệu thủ công và sai sót. Mục này trình bày nguyên lý hoạt động của mô-đun theo năm khía cạnh: cơ chế nhận dạng, lựa chọn engine, phương pháp huấn luyện, trích xuất – đối chiếu dữ liệu và kiến trúc xử lý.</w:t>
+        <w:t xml:space="preserve">Mô-đun OCR số hóa hóa đơn giấy hoặc ảnh chụp thành dữ liệu có cấu trúc nhằm giảm nhập liệu thủ công và sai sót. Hệ thống định tuyến theo loại đầu vào: hóa đơn điện tử dạng PDF có lớp text được đọc trực tiếp bằng trích xuất văn bản (không dùng OCR, độ chính xác gần như tuyệt đối); chỉ hóa đơn dạng ảnh hoặc PDF quét mới đưa qua OCR. Mục này trình bày nguyên lý hoạt động của mô-đun theo năm khía cạnh: cơ chế nhận dạng, lựa chọn engine, phương pháp huấn luyện, trích xuất – đối chiếu dữ liệu và kiến trúc xử lý.</w:t>
       </w:r>
     </w:p>
     <w:p>
@@ -26125,6 +26125,16 @@
         <w:jc w:val="both"/>
       </w:pPr>
       <w:r>
+        <w:t xml:space="preserve">Nhận dạng chữ viết tay: hệ thống hiện chỉ xử lý tốt hóa đơn chữ in (hóa đơn điện tử bản PDF/ảnh và hóa đơn giấy in sẵn). Với hóa đơn viết tay, do nhận dạng chữ viết tay tiếng Việt (Handwritten Text Recognition) là bài toán khó hơn hẳn chữ in và nằm ngoài phạm vi dữ liệu huấn luyện tổng hợp, các mô hình VietOCR/PaddleOCR sau fine-tune cho độ chính xác thấp trên loại chứng từ này. Hiện các hóa đơn viết tay được chuyển sang engine Gemini hoặc nhập liệu thủ công có hỗ trợ đối chiếu; đây là hạn chế chính của mô-đun OCR.</w:t>
+      </w:r>
+    </w:p>
+    <w:p>
+      <w:pPr>
+        <w:spacing w:after="120" w:line="312"/>
+        <w:ind w:firstLine="567"/>
+        <w:jc w:val="both"/>
+      </w:pPr>
+      <w:r>
         <w:rPr>
           <w:rFonts w:ascii="Times New Roman" w:cs="Times New Roman" w:eastAsia="Times New Roman" w:hAnsi="Times New Roman"/>
           <w:b w:val="false"/>
@@ -26156,6 +26166,16 @@
           <w:szCs w:val="26"/>
         </w:rPr>
         <w:t xml:space="preserve">3. Hướng phát triển</w:t>
+      </w:r>
+    </w:p>
+    <w:p>
+      <w:pPr>
+        <w:spacing w:after="120" w:line="312"/>
+        <w:ind w:firstLine="567"/>
+        <w:jc w:val="both"/>
+      </w:pPr>
+      <w:r>
+        <w:t xml:space="preserve">Nhận dạng chữ viết tay tiếng Việt (HTR): thu thập và sinh dữ liệu chữ viết tay có dấu, huấn luyện hoặc tinh chỉnh mô hình chuyên cho chữ viết tay để xử lý hóa đơn, biên nhận viết tay của các nhà cung cấp nhỏ; đồng thời mở rộng đọc trực tiếp hóa đơn điện tử định dạng XML (bản gốc có giá trị pháp lý) bên cạnh bản thể hiện PDF.</w:t>
       </w:r>
     </w:p>
     <w:p>

</xml_diff>